<commit_message>
pp-salygos: šablonai - angliškas nacionalinio saugumo deklaracijos sakinys pagal lietuvišką (korekcija AA)
Dvikalbių SPS (AK, MVP, ND, SSD, TSD), DPS konkretaus pirkimo LT/EN sąlygų ir senos TPS formos
lentelės 3 punktas angliškai sakė, kad Vyriausybė sprendimą priėmė (lietuviškai - nėra priėmusi),
ir nebuvo sandorio. Dabar - „has not adopted ... or the transaction intended to be concluded
(concluded) with them“. 7 vietos, žemėlapiai ir formų rodyklė suderinti, pakartotinai - 0.
Atmetimo pagrindai BPS ir pasiūlymo formose („has adopted“) nekeisti. Naudotojo sprendimas 2026-10-21.

Co-Authored-By: Claude Opus 5.5 <noreply@anthropic.com>
</commit_message>
<xml_diff>
--- a/PP-salygos/templates/ND_LTEN_SPS.docx
+++ b/PP-salygos/templates/ND_LTEN_SPS.docx
@@ -21457,7 +21457,7 @@
                 <w:lang w:val="en-GB"/>
               </w:rPr>
               <w:lastRenderedPageBreak/>
-              <w:t xml:space="preserve">The Government of the Republic of Lithuania, in accordance with the criteria established in the Law on the Protection of Objects Important for Ensuring National Security, has adopted a decision confirming that the entities specified in Clauses 1 </w:t>
+              <w:t xml:space="preserve">The Government of the Republic of Lithuania, in accordance with the criteria established in the Law on the Protection of Objects Important for Ensuring National Security, has not adopted a decision confirming that the entities specified in Clauses 1 and 2 of this table, or the transaction intended to be concluded (concluded) with them,</w:t>
             </w:r>
             <w:r>
               <w:rPr>
@@ -21467,7 +21467,7 @@
                 <w:lang w:val="en-GB"/>
               </w:rPr>
               <w:lastRenderedPageBreak/>
-              <w:t>and / or 2 of this table do not meet national security interests;</w:t>
+              <w:t xml:space="preserve"> do not meet national security interests;</w:t>
             </w:r>
           </w:p>
         </w:tc>

</xml_diff>

<commit_message>
pp-salygos: šablonų metaduomenyse nebėra asmenų duomenų - ND LT/EN SPS komentarų autoriai, el. pašto adresai ir failo savybių autorius (AR)
Naudotojo sprendimas 2026-10-26 (rado PP-plan naujo darbuotojo patikra): ND LT/EN SPS šablone buvo trijų LITGRID darbuotojų vardai,
darbo el. pašto adresai ir prisijungimo ID (komentarai, people.xml, docProps/core.xml) - failo savybės patektų ir į sugeneruotą,
CVP IS skelbiamą dokumentą. Visuose šablonuose dabar „Author“, „A“ ir tuščias autorius; tekstas nekeičiamas, pakartotinai - 0.
PP-salygos testai: 642 (+1 metaduomenų sargas), visi trys rinkinio dalys žalios vietoje.

Co-Authored-By: Claude Opus 5.5 <noreply@anthropic.com>
</commit_message>
<xml_diff>
--- a/PP-salygos/templates/ND_LTEN_SPS.docx
+++ b/PP-salygos/templates/ND_LTEN_SPS.docx
@@ -39103,7 +39103,7 @@
 
 <file path=word/comments.xml><?xml version="1.0" encoding="utf-8"?>
 <w:comments xmlns:wpc="http://schemas.microsoft.com/office/word/2010/wordprocessingCanvas" xmlns:cx="http://schemas.microsoft.com/office/drawing/2014/chartex" xmlns:cx1="http://schemas.microsoft.com/office/drawing/2015/9/8/chartex" xmlns:cx2="http://schemas.microsoft.com/office/drawing/2015/10/21/chartex" xmlns:cx3="http://schemas.microsoft.com/office/drawing/2016/5/9/chartex" xmlns:cx4="http://schemas.microsoft.com/office/drawing/2016/5/10/chartex" xmlns:cx5="http://schemas.microsoft.com/office/drawing/2016/5/11/chartex" xmlns:cx6="http://schemas.microsoft.com/office/drawing/2016/5/12/chartex" xmlns:cx7="http://schemas.microsoft.com/office/drawing/2016/5/13/chartex" xmlns:cx8="http://schemas.microsoft.com/office/drawing/2016/5/14/chartex" xmlns:mc="http://schemas.openxmlformats.org/markup-compatibility/2006" xmlns:aink="http://schemas.microsoft.com/office/drawing/2016/ink" xmlns:am3d="http://schemas.microsoft.com/office/drawing/2017/model3d" xmlns:o="urn:schemas-microsoft-com:office:office" xmlns:oel="http://schemas.microsoft.com/office/2019/extlst" xmlns:r="http://schemas.openxmlformats.org/officeDocument/2006/relationships" xmlns:m="http://schemas.openxmlformats.org/officeDocument/2006/math" xmlns:v="urn:schemas-microsoft-com:vml" xmlns:wp14="http://schemas.microsoft.com/office/word/2010/wordprocessingDrawing" xmlns:wp="http://schemas.openxmlformats.org/drawingml/2006/wordprocessingDrawing" xmlns:w10="urn:schemas-microsoft-com:office:word" xmlns:w="http://schemas.openxmlformats.org/wordprocessingml/2006/main" xmlns:w14="http://schemas.microsoft.com/office/word/2010/wordml" xmlns:w15="http://schemas.microsoft.com/office/word/2012/wordml" xmlns:w16cex="http://schemas.microsoft.com/office/word/2018/wordml/cex" xmlns:w16cid="http://schemas.microsoft.com/office/word/2016/wordml/cid" xmlns:w16="http://schemas.microsoft.com/office/word/2018/wordml" xmlns:w16du="http://schemas.microsoft.com/office/word/2023/wordml/word16du" xmlns:w16sdtdh="http://schemas.microsoft.com/office/word/2020/wordml/sdtdatahash" xmlns:w16sdtfl="http://schemas.microsoft.com/office/word/2024/wordml/sdtformatlock" xmlns:w16se="http://schemas.microsoft.com/office/word/2015/wordml/symex" xmlns:wpg="http://schemas.microsoft.com/office/word/2010/wordprocessingGroup" xmlns:wpi="http://schemas.microsoft.com/office/word/2010/wordprocessingInk" xmlns:wne="http://schemas.microsoft.com/office/word/2006/wordml" xmlns:wps="http://schemas.microsoft.com/office/word/2010/wordprocessingShape" mc:Ignorable="w14 w15 w16se w16cid w16 w16cex w16sdtdh w16sdtfl w16du wp14">
-  <w:comment w:id="6" w:author="Edita Kazakevičienė" w:date="2023-01-17T15:38:00Z" w:initials="EK">
+  <w:comment w:id="6" w:author="Author" w:date="2023-01-17T15:38:00Z" w:initials="A">
     <w:p>
       <w:pPr>
         <w:pStyle w:val="CommentText"/>
@@ -39144,7 +39144,7 @@
       </w:r>
     </w:p>
   </w:comment>
-  <w:comment w:id="8" w:author="Edita Kazakevičienė" w:date="2026-05-18T16:36:00Z" w:initials="EK">
+  <w:comment w:id="8" w:author="Author" w:date="2026-05-18T16:36:00Z" w:initials="A">
     <w:p>
       <w:pPr>
         <w:pStyle w:val="CommentText"/>
@@ -39160,7 +39160,7 @@
       </w:r>
     </w:p>
   </w:comment>
-  <w:comment w:id="9" w:author="Edita Kazakevičienė" w:date="2026-05-25T10:44:00Z" w:initials="EK">
+  <w:comment w:id="9" w:author="Author" w:date="2026-05-25T10:44:00Z" w:initials="A">
     <w:p>
       <w:pPr>
         <w:pStyle w:val="CommentText"/>
@@ -39176,7 +39176,7 @@
       </w:r>
     </w:p>
   </w:comment>
-  <w:comment w:id="10" w:author="Brigita Kuliešiūtė" w:date="2021-06-03T14:08:00Z" w:initials="BK">
+  <w:comment w:id="10" w:author="Author" w:date="2021-06-03T14:08:00Z" w:initials="A">
     <w:p>
       <w:pPr>
         <w:pStyle w:val="CommentText"/>
@@ -39192,7 +39192,7 @@
       </w:r>
     </w:p>
   </w:comment>
-  <w:comment w:id="11" w:author="Brigita Kuliešiūtė" w:date="2023-03-02T16:07:00Z" w:initials="BK">
+  <w:comment w:id="11" w:author="Author" w:date="2023-03-02T16:07:00Z" w:initials="A">
     <w:p>
       <w:pPr>
         <w:pStyle w:val="CommentText"/>
@@ -39208,7 +39208,7 @@
       </w:r>
     </w:p>
   </w:comment>
-  <w:comment w:id="12" w:author="Edita Kazakevičienė" w:date="2023-01-18T07:00:00Z" w:initials="EK">
+  <w:comment w:id="12" w:author="Author" w:date="2023-01-18T07:00:00Z" w:initials="A">
     <w:p>
       <w:pPr>
         <w:pStyle w:val="CommentText"/>
@@ -39224,7 +39224,7 @@
       </w:r>
     </w:p>
   </w:comment>
-  <w:comment w:id="13" w:author="Edita Kazakevičienė" w:date="2023-01-16T21:09:00Z" w:initials="EK">
+  <w:comment w:id="13" w:author="Author" w:date="2023-01-16T21:09:00Z" w:initials="A">
     <w:p>
       <w:pPr>
         <w:pStyle w:val="CommentText"/>
@@ -39281,7 +39281,7 @@
       </w:r>
     </w:p>
   </w:comment>
-  <w:comment w:id="14" w:author="Edita Kazakevičienė" w:date="2023-03-01T15:09:00Z" w:initials="EK">
+  <w:comment w:id="14" w:author="Author" w:date="2023-03-01T15:09:00Z" w:initials="A">
     <w:p>
       <w:pPr>
         <w:pStyle w:val="CommentText"/>
@@ -39308,7 +39308,7 @@
       </w:r>
     </w:p>
   </w:comment>
-  <w:comment w:id="15" w:author="Edita Kazakevičienė" w:date="2025-06-17T16:56:00Z" w:initials="EK">
+  <w:comment w:id="15" w:author="Author" w:date="2025-06-17T16:56:00Z" w:initials="A">
     <w:p>
       <w:pPr>
         <w:pStyle w:val="CommentText"/>
@@ -39324,7 +39324,7 @@
       </w:r>
     </w:p>
   </w:comment>
-  <w:comment w:id="16" w:author="Edita Kazakevičienė" w:date="2023-01-02T15:55:00Z" w:initials="EK">
+  <w:comment w:id="16" w:author="Author" w:date="2023-01-02T15:55:00Z" w:initials="A">
     <w:p>
       <w:pPr>
         <w:pStyle w:val="CommentText"/>
@@ -39344,7 +39344,7 @@
       </w:r>
     </w:p>
   </w:comment>
-  <w:comment w:id="17" w:author="Edita Kazakevičienė" w:date="2023-01-18T14:12:00Z" w:initials="EK">
+  <w:comment w:id="17" w:author="Author" w:date="2023-01-18T14:12:00Z" w:initials="A">
     <w:p>
       <w:pPr>
         <w:pStyle w:val="CommentText"/>
@@ -39371,7 +39371,7 @@
       </w:r>
     </w:p>
   </w:comment>
-  <w:comment w:id="18" w:author="Edita Kazakevičienė" w:date="2023-01-17T16:38:00Z" w:initials="EK">
+  <w:comment w:id="18" w:author="Author" w:date="2023-01-17T16:38:00Z" w:initials="A">
     <w:p>
       <w:pPr>
         <w:pStyle w:val="CommentText"/>
@@ -39387,7 +39387,7 @@
       </w:r>
     </w:p>
   </w:comment>
-  <w:comment w:id="19" w:author="Edita Kazakevičienė" w:date="2023-01-17T18:25:00Z" w:initials="EK">
+  <w:comment w:id="19" w:author="Author" w:date="2023-01-17T18:25:00Z" w:initials="A">
     <w:p>
       <w:pPr>
         <w:pStyle w:val="CommentText"/>
@@ -39403,7 +39403,7 @@
       </w:r>
     </w:p>
   </w:comment>
-  <w:comment w:id="20" w:author="Brigita Kuliešiūtė" w:date="2023-03-02T16:15:00Z" w:initials="BK">
+  <w:comment w:id="20" w:author="Author" w:date="2023-03-02T16:15:00Z" w:initials="A">
     <w:p>
       <w:pPr>
         <w:pStyle w:val="CommentText"/>
@@ -39419,7 +39419,7 @@
       </w:r>
     </w:p>
   </w:comment>
-  <w:comment w:id="23" w:author="Brigita Kuliešiūtė" w:date="2023-03-02T16:15:00Z" w:initials="BK">
+  <w:comment w:id="23" w:author="Author" w:date="2023-03-02T16:15:00Z" w:initials="A">
     <w:p>
       <w:pPr>
         <w:pStyle w:val="CommentText"/>
@@ -39435,7 +39435,7 @@
       </w:r>
     </w:p>
   </w:comment>
-  <w:comment w:id="27" w:author="Edita Kazakevičienė" w:date="2023-01-17T07:58:00Z" w:initials="EK">
+  <w:comment w:id="27" w:author="Author" w:date="2023-01-17T07:58:00Z" w:initials="A">
     <w:p>
       <w:pPr>
         <w:pStyle w:val="CommentText"/>
@@ -39455,7 +39455,7 @@
       </w:r>
     </w:p>
   </w:comment>
-  <w:comment w:id="28" w:author="Edita Kazakevičienė" w:date="2023-01-19T07:18:00Z" w:initials="EK">
+  <w:comment w:id="28" w:author="Author" w:date="2023-01-19T07:18:00Z" w:initials="A">
     <w:p>
       <w:pPr>
         <w:pStyle w:val="CommentText"/>
@@ -39471,7 +39471,7 @@
       </w:r>
     </w:p>
   </w:comment>
-  <w:comment w:id="29" w:author="Edita Kazakevičienė" w:date="2024-03-19T15:30:00Z" w:initials="EK">
+  <w:comment w:id="29" w:author="Author" w:date="2024-03-19T15:30:00Z" w:initials="A">
     <w:p>
       <w:pPr>
         <w:pStyle w:val="CommentText"/>
@@ -39487,7 +39487,7 @@
       </w:r>
     </w:p>
   </w:comment>
-  <w:comment w:id="30" w:author="Edita Kazakevičienė" w:date="2026-09-21T13:21:00Z" w:initials="EK">
+  <w:comment w:id="30" w:author="Author" w:date="2026-09-21T13:21:00Z" w:initials="A">
     <w:p>
       <w:pPr>
         <w:pStyle w:val="CommentText"/>
@@ -39503,7 +39503,7 @@
       </w:r>
     </w:p>
   </w:comment>
-  <w:comment w:id="35" w:author="Edita Kazakevičienė" w:date="2025-05-22T10:47:00Z" w:initials="EK">
+  <w:comment w:id="35" w:author="Author" w:date="2025-05-22T10:47:00Z" w:initials="A">
     <w:p>
       <w:pPr>
         <w:pStyle w:val="CommentText"/>
@@ -39519,7 +39519,7 @@
       </w:r>
     </w:p>
   </w:comment>
-  <w:comment w:id="39" w:author="Brigita Kuliešiūtė" w:date="2021-09-30T14:13:00Z" w:initials="BK">
+  <w:comment w:id="39" w:author="Author" w:date="2021-09-30T14:13:00Z" w:initials="A">
     <w:p>
       <w:pPr>
         <w:pStyle w:val="CommentText"/>
@@ -39535,7 +39535,7 @@
       </w:r>
     </w:p>
   </w:comment>
-  <w:comment w:id="40" w:author="Agnietė Stankevičienė" w:date="2022-04-05T12:28:00Z" w:initials="AS">
+  <w:comment w:id="40" w:author="Author" w:date="2022-04-05T12:28:00Z" w:initials="A">
     <w:p>
       <w:pPr>
         <w:pStyle w:val="CommentText"/>
@@ -42384,15 +42384,9 @@
 
 <file path=word/people.xml><?xml version="1.0" encoding="utf-8"?>
 <w15:people xmlns:wpc="http://schemas.microsoft.com/office/word/2010/wordprocessingCanvas" xmlns:cx="http://schemas.microsoft.com/office/drawing/2014/chartex" xmlns:cx1="http://schemas.microsoft.com/office/drawing/2015/9/8/chartex" xmlns:cx2="http://schemas.microsoft.com/office/drawing/2015/10/21/chartex" xmlns:cx3="http://schemas.microsoft.com/office/drawing/2016/5/9/chartex" xmlns:cx4="http://schemas.microsoft.com/office/drawing/2016/5/10/chartex" xmlns:cx5="http://schemas.microsoft.com/office/drawing/2016/5/11/chartex" xmlns:cx6="http://schemas.microsoft.com/office/drawing/2016/5/12/chartex" xmlns:cx7="http://schemas.microsoft.com/office/drawing/2016/5/13/chartex" xmlns:cx8="http://schemas.microsoft.com/office/drawing/2016/5/14/chartex" xmlns:mc="http://schemas.openxmlformats.org/markup-compatibility/2006" xmlns:aink="http://schemas.microsoft.com/office/drawing/2016/ink" xmlns:am3d="http://schemas.microsoft.com/office/drawing/2017/model3d" xmlns:o="urn:schemas-microsoft-com:office:office" xmlns:oel="http://schemas.microsoft.com/office/2019/extlst" xmlns:r="http://schemas.openxmlformats.org/officeDocument/2006/relationships" xmlns:m="http://schemas.openxmlformats.org/officeDocument/2006/math" xmlns:v="urn:schemas-microsoft-com:vml" xmlns:wp14="http://schemas.microsoft.com/office/word/2010/wordprocessingDrawing" xmlns:wp="http://schemas.openxmlformats.org/drawingml/2006/wordprocessingDrawing" xmlns:w10="urn:schemas-microsoft-com:office:word" xmlns:w="http://schemas.openxmlformats.org/wordprocessingml/2006/main" xmlns:w14="http://schemas.microsoft.com/office/word/2010/wordml" xmlns:w15="http://schemas.microsoft.com/office/word/2012/wordml" xmlns:w16cex="http://schemas.microsoft.com/office/word/2018/wordml/cex" xmlns:w16cid="http://schemas.microsoft.com/office/word/2016/wordml/cid" xmlns:w16="http://schemas.microsoft.com/office/word/2018/wordml" xmlns:w16du="http://schemas.microsoft.com/office/word/2023/wordml/word16du" xmlns:w16sdtdh="http://schemas.microsoft.com/office/word/2020/wordml/sdtdatahash" xmlns:w16sdtfl="http://schemas.microsoft.com/office/word/2024/wordml/sdtformatlock" xmlns:w16se="http://schemas.microsoft.com/office/word/2015/wordml/symex" xmlns:wpg="http://schemas.microsoft.com/office/word/2010/wordprocessingGroup" xmlns:wpi="http://schemas.microsoft.com/office/word/2010/wordprocessingInk" xmlns:wne="http://schemas.microsoft.com/office/word/2006/wordml" xmlns:wps="http://schemas.microsoft.com/office/word/2010/wordprocessingShape" mc:Ignorable="w14 w15 w16se w16cid w16 w16cex w16sdtdh w16sdtfl w16du wp14">
-  <w15:person w15:author="Edita Kazakevičienė">
-    <w15:presenceInfo w15:providerId="AD" w15:userId="S::Edita.Kazakeviciene@litgrid.eu::e8913e2d-8ce1-4152-8210-de9f3089851d"/>
-  </w15:person>
-  <w15:person w15:author="Brigita Kuliešiūtė">
-    <w15:presenceInfo w15:providerId="AD" w15:userId="S::Brigita.Kuliesiute@litgrid.eu::337c79b4-6750-47f0-b035-49d5d1d782fe"/>
-  </w15:person>
-  <w15:person w15:author="Agnietė Stankevičienė">
-    <w15:presenceInfo w15:providerId="AD" w15:userId="S::Agniete.Stankeviciene@litgrid.eu::71bafee1-fd8d-43fa-bc73-f8f221e35f7c"/>
-  </w15:person>
+  <w15:person w15:author="Author"/>
+  <w15:person w15:author="Author"/>
+  <w15:person w15:author="Author"/>
 </w15:people>
 </file>
 

</xml_diff>